<commit_message>
TE3: audit fixes (Unit Circle 2 figure no longer gives the answer, tan(pi/3) speech, radical secant, cotangent and theta = 0 items, fresh summary examples), audit notes, README row
Co-Authored-By: Claude Opus 5.5 <noreply@anthropic.com>
Claude-Session: https://claude.ai/code/session_013Y8PfETWcMLvmUEpCdE8Wq
</commit_message>
<xml_diff>
--- a/support-materials/TE3/TE3_worked_examples.docx
+++ b/support-materials/TE3/TE3_worked_examples.docx
@@ -400,7 +400,7 @@
           <w:i/>
           <w:iCs/>
         </w:rPr>
-        <w:t xml:space="preserve">π/6,(5π)/6</w:t>
+        <w:t xml:space="preserve">π/6, (5π)/6</w:t>
       </w:r>
       <w:r>
         <w:t xml:space="preserve"> has sine </w:t>
@@ -592,17 +592,17 @@
           <w:i/>
           <w:iCs/>
         </w:rPr>
-        <w:t xml:space="preserve">π/4</w:t>
-      </w:r>
-      <w:r>
-        <w:t xml:space="preserve">, </w:t>
-      </w:r>
-      <w:r>
-        <w:rPr>
-          <w:i/>
-          <w:iCs/>
-        </w:rPr>
-        <w:t xml:space="preserve">(7π)/4</w:t>
+        <w:t xml:space="preserve">(2π)/3</w:t>
+      </w:r>
+      <w:r>
+        <w:t xml:space="preserve">, </w:t>
+      </w:r>
+      <w:r>
+        <w:rPr>
+          <w:i/>
+          <w:iCs/>
+        </w:rPr>
+        <w:t xml:space="preserve">(4π)/3</w:t>
       </w:r>
     </w:p>
     <w:p>
@@ -632,7 +632,7 @@
           <w:i/>
           <w:iCs/>
         </w:rPr>
-        <w:t xml:space="preserve">(7π)/4</w:t>
+        <w:t xml:space="preserve">(5π)/4</w:t>
       </w:r>
     </w:p>
     <w:p>
@@ -652,17 +652,17 @@
           <w:i/>
           <w:iCs/>
         </w:rPr>
-        <w:t xml:space="preserve">(5π)/4</w:t>
-      </w:r>
-      <w:r>
-        <w:t xml:space="preserve">, </w:t>
-      </w:r>
-      <w:r>
-        <w:rPr>
-          <w:i/>
-          <w:iCs/>
-        </w:rPr>
-        <w:t xml:space="preserve">(7π)/4</w:t>
+        <w:t xml:space="preserve">(5π)/6</w:t>
+      </w:r>
+      <w:r>
+        <w:t xml:space="preserve">, </w:t>
+      </w:r>
+      <w:r>
+        <w:rPr>
+          <w:i/>
+          <w:iCs/>
+        </w:rPr>
+        <w:t xml:space="preserve">(7π)/6</w:t>
       </w:r>
     </w:p>
     <w:p>
@@ -683,16 +683,6 @@
           <w:iCs/>
         </w:rPr>
         <w:t xml:space="preserve">(3π)/4</w:t>
-      </w:r>
-      <w:r>
-        <w:t xml:space="preserve">, </w:t>
-      </w:r>
-      <w:r>
-        <w:rPr>
-          <w:i/>
-          <w:iCs/>
-        </w:rPr>
-        <w:t xml:space="preserve">(5π)/4</w:t>
       </w:r>
     </w:p>
     <w:p>
@@ -772,27 +762,57 @@
         <w:t xml:space="preserve">(5π)/4</w:t>
       </w:r>
       <w:r>
-        <w:t xml:space="preserve">. The pair </w:t>
-      </w:r>
-      <w:r>
-        <w:rPr>
-          <w:i/>
-          <w:iCs/>
-        </w:rPr>
-        <w:t xml:space="preserve">π/4,(7π)/4</w:t>
-      </w:r>
-      <w:r>
-        <w:t xml:space="preserve"> has cosine </w:t>
-      </w:r>
-      <w:r>
-        <w:rPr>
-          <w:i/>
-          <w:iCs/>
-        </w:rPr>
-        <w:t xml:space="preserve">+(√2)/2</w:t>
-      </w:r>
-      <w:r>
-        <w:t xml:space="preserve">. The other pairs each include an angle on the right side, where cosine is positive. </w:t>
+        <w:t xml:space="preserve">. The pairs </w:t>
+      </w:r>
+      <w:r>
+        <w:rPr>
+          <w:i/>
+          <w:iCs/>
+        </w:rPr>
+        <w:t xml:space="preserve">(2π)/3, (4π)/3</w:t>
+      </w:r>
+      <w:r>
+        <w:t xml:space="preserve"> and </w:t>
+      </w:r>
+      <w:r>
+        <w:rPr>
+          <w:i/>
+          <w:iCs/>
+        </w:rPr>
+        <w:t xml:space="preserve">(5π)/6, (7π)/6</w:t>
+      </w:r>
+      <w:r>
+        <w:t xml:space="preserve"> are on the left side too, but their cosines are </w:t>
+      </w:r>
+      <w:r>
+        <w:rPr>
+          <w:i/>
+          <w:iCs/>
+        </w:rPr>
+        <w:t xml:space="preserve">−1/2</w:t>
+      </w:r>
+      <w:r>
+        <w:t xml:space="preserve"> and </w:t>
+      </w:r>
+      <w:r>
+        <w:rPr>
+          <w:i/>
+          <w:iCs/>
+        </w:rPr>
+        <w:t xml:space="preserve">−(√3)/2</w:t>
+      </w:r>
+      <w:r>
+        <w:t xml:space="preserve">. Stopping at </w:t>
+      </w:r>
+      <w:r>
+        <w:rPr>
+          <w:i/>
+          <w:iCs/>
+        </w:rPr>
+        <w:t xml:space="preserve">(3π)/4</w:t>
+      </w:r>
+      <w:r>
+        <w:t xml:space="preserve"> misses the crossing below the axis. </w:t>
       </w:r>
       <w:r>
         <w:rPr>
@@ -827,19 +847,28 @@
       </w:pPr>
       <w:r>
         <w:rPr>
+          <w:i/>
+          <w:iCs/>
           <w:sz w:val="40"/>
           <w:szCs w:val="40"/>
         </w:rPr>
-        <w:t xml:space="preserve">sec</w:t>
-      </w:r>
-      <w:r>
-        <w:rPr>
-          <w:i/>
-          <w:iCs/>
+        <w:t xml:space="preserve">3 </w:t>
+      </w:r>
+      <w:r>
+        <w:rPr>
           <w:sz w:val="40"/>
           <w:szCs w:val="40"/>
         </w:rPr>
-        <w:t xml:space="preserve">θ−2=0</w:t>
+        <w:t xml:space="preserve">sec</w:t>
+      </w:r>
+      <w:r>
+        <w:rPr>
+          <w:i/>
+          <w:iCs/>
+          <w:sz w:val="40"/>
+          <w:szCs w:val="40"/>
+        </w:rPr>
+        <w:t xml:space="preserve">θ−2√3=0</w:t>
       </w:r>
     </w:p>
     <w:p>
@@ -872,7 +901,21 @@
         <w:t xml:space="preserve">A.  </w:t>
       </w:r>
       <w:r>
-        <w:t xml:space="preserve">No solution: cosine cannot equal 2</w:t>
+        <w:rPr>
+          <w:i/>
+          <w:iCs/>
+        </w:rPr>
+        <w:t xml:space="preserve">(7π)/6</w:t>
+      </w:r>
+      <w:r>
+        <w:t xml:space="preserve">, </w:t>
+      </w:r>
+      <w:r>
+        <w:rPr>
+          <w:i/>
+          <w:iCs/>
+        </w:rPr>
+        <w:t xml:space="preserve">(11π)/6</w:t>
       </w:r>
     </w:p>
     <w:p>
@@ -888,6 +931,22 @@
         <w:t xml:space="preserve">B.  </w:t>
       </w:r>
       <w:r>
+        <w:t xml:space="preserve">No solution: cosine cannot be more than 1</w:t>
+      </w:r>
+    </w:p>
+    <w:p>
+      <w:pPr>
+        <w:spacing w:after="40" w:before="20"/>
+        <w:ind w:left="360"/>
+      </w:pPr>
+      <w:r>
+        <w:rPr>
+          <w:b/>
+          <w:bCs/>
+        </w:rPr>
+        <w:t xml:space="preserve">C.  </w:t>
+      </w:r>
+      <w:r>
         <w:rPr>
           <w:i/>
           <w:iCs/>
@@ -902,20 +961,20 @@
           <w:i/>
           <w:iCs/>
         </w:rPr>
-        <w:t xml:space="preserve">(5π)/6</w:t>
-      </w:r>
-    </w:p>
-    <w:p>
-      <w:pPr>
-        <w:spacing w:after="40" w:before="20"/>
-        <w:ind w:left="360"/>
-      </w:pPr>
-      <w:r>
-        <w:rPr>
-          <w:b/>
-          <w:bCs/>
-        </w:rPr>
-        <w:t xml:space="preserve">C.  </w:t>
+        <w:t xml:space="preserve">(11π)/6</w:t>
+      </w:r>
+    </w:p>
+    <w:p>
+      <w:pPr>
+        <w:spacing w:after="40" w:before="20"/>
+        <w:ind w:left="360"/>
+      </w:pPr>
+      <w:r>
+        <w:rPr>
+          <w:b/>
+          <w:bCs/>
+        </w:rPr>
+        <w:t xml:space="preserve">D.  </w:t>
       </w:r>
       <w:r>
         <w:rPr>
@@ -933,36 +992,6 @@
           <w:iCs/>
         </w:rPr>
         <w:t xml:space="preserve">(5π)/3</w:t>
-      </w:r>
-    </w:p>
-    <w:p>
-      <w:pPr>
-        <w:spacing w:after="40" w:before="20"/>
-        <w:ind w:left="360"/>
-      </w:pPr>
-      <w:r>
-        <w:rPr>
-          <w:b/>
-          <w:bCs/>
-        </w:rPr>
-        <w:t xml:space="preserve">D.  </w:t>
-      </w:r>
-      <w:r>
-        <w:rPr>
-          <w:i/>
-          <w:iCs/>
-        </w:rPr>
-        <w:t xml:space="preserve">(2π)/3</w:t>
-      </w:r>
-      <w:r>
-        <w:t xml:space="preserve">, </w:t>
-      </w:r>
-      <w:r>
-        <w:rPr>
-          <w:i/>
-          <w:iCs/>
-        </w:rPr>
-        <w:t xml:space="preserve">(4π)/3</w:t>
       </w:r>
     </w:p>
     <w:p>
@@ -979,6 +1008,9 @@
         <w:spacing w:after="120" w:before="80" w:line="300"/>
       </w:pPr>
       <w:r>
+        <w:t xml:space="preserve">Isolate: </w:t>
+      </w:r>
+      <w:r>
         <w:t xml:space="preserve">sec</w:t>
       </w:r>
       <w:r>
@@ -986,17 +1018,10 @@
           <w:i/>
           <w:iCs/>
         </w:rPr>
-        <w:t xml:space="preserve">θ=2</w:t>
-      </w:r>
-      <w:r>
-        <w:t xml:space="preserve"> means </w:t>
-      </w:r>
-      <w:r>
-        <w:rPr>
-          <w:i/>
-          <w:iCs/>
-        </w:rPr>
-        <w:t xml:space="preserve">1/(</w:t>
+        <w:t xml:space="preserve">θ=(2√3)/3</w:t>
+      </w:r>
+      <w:r>
+        <w:t xml:space="preserve">. Flip to cosine and rationalize: </w:t>
       </w:r>
       <w:r>
         <w:t xml:space="preserve">cos</w:t>
@@ -1006,20 +1031,7 @@
           <w:i/>
           <w:iCs/>
         </w:rPr>
-        <w:t xml:space="preserve">θ)=2</w:t>
-      </w:r>
-      <w:r>
-        <w:t xml:space="preserve">, so </w:t>
-      </w:r>
-      <w:r>
-        <w:t xml:space="preserve">cos</w:t>
-      </w:r>
-      <w:r>
-        <w:rPr>
-          <w:i/>
-          <w:iCs/>
-        </w:rPr>
-        <w:t xml:space="preserve">θ=1/2</w:t>
+        <w:t xml:space="preserve">θ=3/(2√3)=(√3)/2</w:t>
       </w:r>
       <w:r>
         <w:t xml:space="preserve">. That happens at </w:t>
@@ -1029,7 +1041,7 @@
           <w:i/>
           <w:iCs/>
         </w:rPr>
-        <w:t xml:space="preserve">π/3</w:t>
+        <w:t xml:space="preserve">π/6</w:t>
       </w:r>
       <w:r>
         <w:t xml:space="preserve"> and at </w:t>
@@ -1039,10 +1051,50 @@
           <w:i/>
           <w:iCs/>
         </w:rPr>
-        <w:t xml:space="preserve">2π−π/3=(5π)/3</w:t>
-      </w:r>
-      <w:r>
-        <w:t xml:space="preserve">. Secant can equal 2; it is cosine that must stay between −1 and 1, and </w:t>
+        <w:t xml:space="preserve">2π−π/6=(11π)/6</w:t>
+      </w:r>
+      <w:r>
+        <w:t xml:space="preserve">. It is secant that equals </w:t>
+      </w:r>
+      <w:r>
+        <w:rPr>
+          <w:i/>
+          <w:iCs/>
+        </w:rPr>
+        <w:t xml:space="preserve">(2√3)/3≈ 1.15</w:t>
+      </w:r>
+      <w:r>
+        <w:t xml:space="preserve">; after flipping, the cosine is about 0.87, which is fine. The pair </w:t>
+      </w:r>
+      <w:r>
+        <w:rPr>
+          <w:i/>
+          <w:iCs/>
+        </w:rPr>
+        <w:t xml:space="preserve">(7π)/6, (11π)/6</w:t>
+      </w:r>
+      <w:r>
+        <w:t xml:space="preserve"> has sine </w:t>
+      </w:r>
+      <w:r>
+        <w:rPr>
+          <w:i/>
+          <w:iCs/>
+        </w:rPr>
+        <w:t xml:space="preserve">−1/2</w:t>
+      </w:r>
+      <w:r>
+        <w:t xml:space="preserve">, and </w:t>
+      </w:r>
+      <w:r>
+        <w:rPr>
+          <w:i/>
+          <w:iCs/>
+        </w:rPr>
+        <w:t xml:space="preserve">π/3, (5π)/3</w:t>
+      </w:r>
+      <w:r>
+        <w:t xml:space="preserve"> has cosine </w:t>
       </w:r>
       <w:r>
         <w:rPr>
@@ -1052,46 +1104,6 @@
         <w:t xml:space="preserve">1/2</w:t>
       </w:r>
       <w:r>
-        <w:t xml:space="preserve"> does. The pair </w:t>
-      </w:r>
-      <w:r>
-        <w:rPr>
-          <w:i/>
-          <w:iCs/>
-        </w:rPr>
-        <w:t xml:space="preserve">π/6,(5π)/6</w:t>
-      </w:r>
-      <w:r>
-        <w:t xml:space="preserve"> has sine </w:t>
-      </w:r>
-      <w:r>
-        <w:rPr>
-          <w:i/>
-          <w:iCs/>
-        </w:rPr>
-        <w:t xml:space="preserve">1/2</w:t>
-      </w:r>
-      <w:r>
-        <w:t xml:space="preserve">, and </w:t>
-      </w:r>
-      <w:r>
-        <w:rPr>
-          <w:i/>
-          <w:iCs/>
-        </w:rPr>
-        <w:t xml:space="preserve">(2π)/3,(4π)/3</w:t>
-      </w:r>
-      <w:r>
-        <w:t xml:space="preserve"> has cosine </w:t>
-      </w:r>
-      <w:r>
-        <w:rPr>
-          <w:i/>
-          <w:iCs/>
-        </w:rPr>
-        <w:t xml:space="preserve">−1/2</w:t>
-      </w:r>
-      <w:r>
         <w:t xml:space="preserve">. </w:t>
       </w:r>
       <w:r>
@@ -1101,7 +1113,7 @@
           <w:i/>
           <w:iCs/>
         </w:rPr>
-        <w:t xml:space="preserve">θ=π/3, (5π)/3</w:t>
+        <w:t xml:space="preserve">θ=π/6, (11π)/6</w:t>
       </w:r>
       <w:r>
         <w:rPr>
@@ -1398,7 +1410,7 @@
           <w:i/>
           <w:iCs/>
         </w:rPr>
-        <w:t xml:space="preserve">y=(√3)/3x</w:t>
+        <w:t xml:space="preserve">y=((√3)/3)x</w:t>
       </w:r>
       <w:r>
         <w:t xml:space="preserve"> crosses the circle at two opposite points: </w:t>
@@ -1438,7 +1450,7 @@
           <w:i/>
           <w:iCs/>
         </w:rPr>
-        <w:t xml:space="preserve">π/3,(4π)/3</w:t>
+        <w:t xml:space="preserve">π/3, (4π)/3</w:t>
       </w:r>
       <w:r>
         <w:t xml:space="preserve"> has tangent </w:t>
@@ -1546,6 +1558,16 @@
         </w:rPr>
         <w:t xml:space="preserve">π/6+2π k</w:t>
       </w:r>
+      <w:r>
+        <w:t xml:space="preserve">, </w:t>
+      </w:r>
+      <w:r>
+        <w:rPr>
+          <w:i/>
+          <w:iCs/>
+        </w:rPr>
+        <w:t xml:space="preserve">(5π)/6+2π k</w:t>
+      </w:r>
     </w:p>
     <w:p>
       <w:pPr>
@@ -1565,16 +1587,6 @@
           <w:iCs/>
         </w:rPr>
         <w:t xml:space="preserve">π/6+2π k</w:t>
-      </w:r>
-      <w:r>
-        <w:t xml:space="preserve">, </w:t>
-      </w:r>
-      <w:r>
-        <w:rPr>
-          <w:i/>
-          <w:iCs/>
-        </w:rPr>
-        <w:t xml:space="preserve">(5π)/6+2π k</w:t>
       </w:r>
     </w:p>
     <w:p>
@@ -2002,14 +2014,34 @@
         <w:t xml:space="preserve">(3π)/4+π k</w:t>
       </w:r>
       <w:r>
-        <w:t xml:space="preserve">. CheckIt writes the longer form. The pair </w:t>
-      </w:r>
-      <w:r>
-        <w:rPr>
-          <w:i/>
-          <w:iCs/>
-        </w:rPr>
-        <w:t xml:space="preserve">π/4,(5π)/4</w:t>
+        <w:t xml:space="preserve">. CheckIt writes the longer form. Keeping only </w:t>
+      </w:r>
+      <w:r>
+        <w:rPr>
+          <w:i/>
+          <w:iCs/>
+        </w:rPr>
+        <w:t xml:space="preserve">(3π)/4+2π k</w:t>
+      </w:r>
+      <w:r>
+        <w:t xml:space="preserve"> misses </w:t>
+      </w:r>
+      <w:r>
+        <w:rPr>
+          <w:i/>
+          <w:iCs/>
+        </w:rPr>
+        <w:t xml:space="preserve">(7π)/4</w:t>
+      </w:r>
+      <w:r>
+        <w:t xml:space="preserve">. The pair </w:t>
+      </w:r>
+      <w:r>
+        <w:rPr>
+          <w:i/>
+          <w:iCs/>
+        </w:rPr>
+        <w:t xml:space="preserve">π/4, (5π)/4</w:t>
       </w:r>
       <w:r>
         <w:t xml:space="preserve"> has tangent </w:t>
@@ -2022,7 +2054,7 @@
         <w:t xml:space="preserve">+1</w:t>
       </w:r>
       <w:r>
-        <w:t xml:space="preserve">, and at </w:t>
+        <w:t xml:space="preserve">, and so does </w:t>
       </w:r>
       <w:r>
         <w:rPr>
@@ -2032,17 +2064,7 @@
         <w:t xml:space="preserve">(5π)/4</w:t>
       </w:r>
       <w:r>
-        <w:t xml:space="preserve"> the tangent is </w:t>
-      </w:r>
-      <w:r>
-        <w:rPr>
-          <w:i/>
-          <w:iCs/>
-        </w:rPr>
-        <w:t xml:space="preserve">+1</w:t>
-      </w:r>
-      <w:r>
-        <w:t xml:space="preserve">. </w:t>
+        <w:t xml:space="preserve"> in the remaining choice. </w:t>
       </w:r>
       <w:r>
         <w:rPr>
@@ -2077,19 +2099,28 @@
       </w:pPr>
       <w:r>
         <w:rPr>
+          <w:i/>
+          <w:iCs/>
           <w:sz w:val="40"/>
           <w:szCs w:val="40"/>
         </w:rPr>
-        <w:t xml:space="preserve">cos</w:t>
-      </w:r>
-      <w:r>
-        <w:rPr>
-          <w:i/>
-          <w:iCs/>
+        <w:t xml:space="preserve">3 </w:t>
+      </w:r>
+      <w:r>
+        <w:rPr>
           <w:sz w:val="40"/>
           <w:szCs w:val="40"/>
         </w:rPr>
-        <w:t xml:space="preserve">θ=0</w:t>
+        <w:t xml:space="preserve">cot</w:t>
+      </w:r>
+      <w:r>
+        <w:rPr>
+          <w:i/>
+          <w:iCs/>
+          <w:sz w:val="40"/>
+          <w:szCs w:val="40"/>
+        </w:rPr>
+        <w:t xml:space="preserve">θ−√3=0</w:t>
       </w:r>
     </w:p>
     <w:p>
@@ -2126,17 +2157,7 @@
           <w:i/>
           <w:iCs/>
         </w:rPr>
-        <w:t xml:space="preserve">2π k</w:t>
-      </w:r>
-      <w:r>
-        <w:t xml:space="preserve">, </w:t>
-      </w:r>
-      <w:r>
-        <w:rPr>
-          <w:i/>
-          <w:iCs/>
-        </w:rPr>
-        <w:t xml:space="preserve">π+2π k</w:t>
+        <w:t xml:space="preserve">π/3+2π k</w:t>
       </w:r>
     </w:p>
     <w:p>
@@ -2156,7 +2177,17 @@
           <w:i/>
           <w:iCs/>
         </w:rPr>
-        <w:t xml:space="preserve">π/2+2π k</w:t>
+        <w:t xml:space="preserve">π/6+2π k</w:t>
+      </w:r>
+      <w:r>
+        <w:t xml:space="preserve">, </w:t>
+      </w:r>
+      <w:r>
+        <w:rPr>
+          <w:i/>
+          <w:iCs/>
+        </w:rPr>
+        <w:t xml:space="preserve">(7π)/6+2π k</w:t>
       </w:r>
     </w:p>
     <w:p>
@@ -2176,17 +2207,17 @@
           <w:i/>
           <w:iCs/>
         </w:rPr>
-        <w:t xml:space="preserve">π/2+2π k</w:t>
-      </w:r>
-      <w:r>
-        <w:t xml:space="preserve">, </w:t>
-      </w:r>
-      <w:r>
-        <w:rPr>
-          <w:i/>
-          <w:iCs/>
-        </w:rPr>
-        <w:t xml:space="preserve">(3π)/2+2π k</w:t>
+        <w:t xml:space="preserve">π/3+2π k</w:t>
+      </w:r>
+      <w:r>
+        <w:t xml:space="preserve">, </w:t>
+      </w:r>
+      <w:r>
+        <w:rPr>
+          <w:i/>
+          <w:iCs/>
+        </w:rPr>
+        <w:t xml:space="preserve">(2π)/3+2π k</w:t>
       </w:r>
     </w:p>
     <w:p>
@@ -2206,17 +2237,17 @@
           <w:i/>
           <w:iCs/>
         </w:rPr>
-        <w:t xml:space="preserve">π/2+2π k</w:t>
-      </w:r>
-      <w:r>
-        <w:t xml:space="preserve">, </w:t>
-      </w:r>
-      <w:r>
-        <w:rPr>
-          <w:i/>
-          <w:iCs/>
-        </w:rPr>
-        <w:t xml:space="preserve">(5π)/2+2π k</w:t>
+        <w:t xml:space="preserve">π/3+2π k</w:t>
+      </w:r>
+      <w:r>
+        <w:t xml:space="preserve">, </w:t>
+      </w:r>
+      <w:r>
+        <w:rPr>
+          <w:i/>
+          <w:iCs/>
+        </w:rPr>
+        <w:t xml:space="preserve">(4π)/3+2π k</w:t>
       </w:r>
     </w:p>
     <w:p>
@@ -2233,24 +2264,40 @@
         <w:spacing w:after="120" w:before="80" w:line="300"/>
       </w:pPr>
       <w:r>
-        <w:t xml:space="preserve">Cosine is the </w:t>
-      </w:r>
-      <w:r>
-        <w:rPr>
-          <w:i/>
-          <w:iCs/>
-        </w:rPr>
-        <w:t xml:space="preserve">x</w:t>
-      </w:r>
-      <w:r>
-        <w:t xml:space="preserve">-coordinate, which is 0 at the top and bottom of the circle: </w:t>
-      </w:r>
-      <w:r>
-        <w:rPr>
-          <w:i/>
-          <w:iCs/>
-        </w:rPr>
-        <w:t xml:space="preserve">π/2</w:t>
+        <w:t xml:space="preserve">Isolate: </w:t>
+      </w:r>
+      <w:r>
+        <w:t xml:space="preserve">cot</w:t>
+      </w:r>
+      <w:r>
+        <w:rPr>
+          <w:i/>
+          <w:iCs/>
+        </w:rPr>
+        <w:t xml:space="preserve">θ=(√3)/3</w:t>
+      </w:r>
+      <w:r>
+        <w:t xml:space="preserve">. Flip: </w:t>
+      </w:r>
+      <w:r>
+        <w:t xml:space="preserve">tan</w:t>
+      </w:r>
+      <w:r>
+        <w:rPr>
+          <w:i/>
+          <w:iCs/>
+        </w:rPr>
+        <w:t xml:space="preserve">θ=3/(√3)=√3</w:t>
+      </w:r>
+      <w:r>
+        <w:t xml:space="preserve">, at </w:t>
+      </w:r>
+      <w:r>
+        <w:rPr>
+          <w:i/>
+          <w:iCs/>
+        </w:rPr>
+        <w:t xml:space="preserve">π/3</w:t>
       </w:r>
       <w:r>
         <w:t xml:space="preserve"> and </w:t>
@@ -2260,69 +2307,72 @@
           <w:i/>
           <w:iCs/>
         </w:rPr>
-        <w:t xml:space="preserve">(3π)/2</w:t>
-      </w:r>
-      <w:r>
-        <w:t xml:space="preserve">. Adding </w:t>
-      </w:r>
-      <w:r>
-        <w:rPr>
-          <w:i/>
-          <w:iCs/>
-        </w:rPr>
-        <w:t xml:space="preserve">2π k</w:t>
-      </w:r>
-      <w:r>
-        <w:t xml:space="preserve"> to each gives all solutions; </w:t>
-      </w:r>
-      <w:r>
-        <w:rPr>
-          <w:i/>
-          <w:iCs/>
-        </w:rPr>
-        <w:t xml:space="preserve">π/2+π k</w:t>
-      </w:r>
-      <w:r>
-        <w:t xml:space="preserve"> says the same thing. The list </w:t>
-      </w:r>
-      <w:r>
-        <w:rPr>
-          <w:i/>
-          <w:iCs/>
-        </w:rPr>
-        <w:t xml:space="preserve">2π k, π+2π k</w:t>
-      </w:r>
-      <w:r>
-        <w:t xml:space="preserve"> is where sine is 0, and </w:t>
-      </w:r>
-      <w:r>
-        <w:rPr>
-          <w:i/>
-          <w:iCs/>
-        </w:rPr>
-        <w:t xml:space="preserve">(5π)/2</w:t>
-      </w:r>
-      <w:r>
-        <w:t xml:space="preserve"> is the same point as </w:t>
-      </w:r>
-      <w:r>
-        <w:rPr>
-          <w:i/>
-          <w:iCs/>
-        </w:rPr>
-        <w:t xml:space="preserve">π/2</w:t>
-      </w:r>
-      <w:r>
-        <w:t xml:space="preserve">, so that list misses the bottom of the circle. </w:t>
-      </w:r>
-      <w:r>
-        <w:rPr>
-          <w:b/>
-          <w:bCs/>
-          <w:i/>
-          <w:iCs/>
-        </w:rPr>
-        <w:t xml:space="preserve">θ=π/2+2π k, (3π)/2+2π k</w:t>
+        <w:t xml:space="preserve">π/3+π=(4π)/3</w:t>
+      </w:r>
+      <w:r>
+        <w:t xml:space="preserve">. The pair </w:t>
+      </w:r>
+      <w:r>
+        <w:rPr>
+          <w:i/>
+          <w:iCs/>
+        </w:rPr>
+        <w:t xml:space="preserve">π/6, (7π)/6</w:t>
+      </w:r>
+      <w:r>
+        <w:t xml:space="preserve"> solves </w:t>
+      </w:r>
+      <w:r>
+        <w:t xml:space="preserve">tan</w:t>
+      </w:r>
+      <w:r>
+        <w:rPr>
+          <w:i/>
+          <w:iCs/>
+        </w:rPr>
+        <w:t xml:space="preserve">θ=(√3)/3</w:t>
+      </w:r>
+      <w:r>
+        <w:t xml:space="preserve">, forgetting to flip. At </w:t>
+      </w:r>
+      <w:r>
+        <w:rPr>
+          <w:i/>
+          <w:iCs/>
+        </w:rPr>
+        <w:t xml:space="preserve">(2π)/3</w:t>
+      </w:r>
+      <w:r>
+        <w:t xml:space="preserve"> the tangent is </w:t>
+      </w:r>
+      <w:r>
+        <w:rPr>
+          <w:i/>
+          <w:iCs/>
+        </w:rPr>
+        <w:t xml:space="preserve">−√3</w:t>
+      </w:r>
+      <w:r>
+        <w:t xml:space="preserve">, and keeping only </w:t>
+      </w:r>
+      <w:r>
+        <w:rPr>
+          <w:i/>
+          <w:iCs/>
+        </w:rPr>
+        <w:t xml:space="preserve">π/3+2π k</w:t>
+      </w:r>
+      <w:r>
+        <w:t xml:space="preserve"> loses half the solutions. </w:t>
+      </w:r>
+      <w:r>
+        <w:rPr>
+          <w:b/>
+          <w:bCs/>
+          <w:i/>
+          <w:iCs/>
+        </w:rPr>
+        <w:t xml:space="preserve">θ=π/3+2π k, (4π)/3+2π k</w:t>
       </w:r>
       <w:r>
         <w:rPr>
@@ -2523,7 +2573,7 @@
         <w:t xml:space="preserve">θ=−1/2</w:t>
       </w:r>
       <w:r>
-        <w:t xml:space="preserve">. Cosecant can be negative; it just can never be between −1 and 1. Sine is </w:t>
+        <w:t xml:space="preserve">. Cosecant can be negative; it just can never be strictly between −1 and 1. Sine is </w:t>
       </w:r>
       <w:r>
         <w:rPr>
@@ -2563,7 +2613,17 @@
         <w:t xml:space="preserve">2π−π/6=(11π)/6</w:t>
       </w:r>
       <w:r>
-        <w:t xml:space="preserve">. The first pair has sine </w:t>
+        <w:t xml:space="preserve">. The pair </w:t>
+      </w:r>
+      <w:r>
+        <w:rPr>
+          <w:i/>
+          <w:iCs/>
+        </w:rPr>
+        <w:t xml:space="preserve">π/6, (5π)/6</w:t>
+      </w:r>
+      <w:r>
+        <w:t xml:space="preserve"> has sine </w:t>
       </w:r>
       <w:r>
         <w:rPr>
@@ -2630,7 +2690,7 @@
           <wp:inline distT="0" distB="0" distL="0" distR="0">
             <wp:extent cx="4048125" cy="2476500"/>
             <wp:effectExtent t="0" r="0" b="0" l="0"/>
-            <wp:docPr id="1" name="sq1" descr="The unit circle crossed by two horizontal lines. Plotted data: The unit circle, centered at the origin with radius 1. Two dashed horizontal lines cross it: y = square root of 3 over 2, above the x-axis, and y = negative square root of 3 over 2, below it. Each line crosses the circle at two points, one on each side of the y-axis, for four points in all. The points are marked with dots but not labeled." title="The unit circle crossed by two horizontal lines"/>
+            <wp:docPr id="1" name="sq1" descr="The unit circle crossed by a horizontal line. Plotted data: The unit circle, centered at the origin with radius 1. A dashed horizontal line y = square root of 3 over 2 crosses the circle at two points above the x-axis, one on each side of the y-axis. The points are marked with dots but not labeled." title="The unit circle crossed by a horizontal line"/>
             <wp:cNvGraphicFramePr>
               <a:graphicFrameLocks xmlns:a="http://schemas.openxmlformats.org/drawingml/2006/main" noChangeAspect="1"/>
             </wp:cNvGraphicFramePr>
@@ -2684,7 +2744,7 @@
           <w:sz w:val="22"/>
           <w:szCs w:val="22"/>
         </w:rPr>
-        <w:t xml:space="preserve">The unit circle, centered at the origin with radius 1. Two dashed horizontal lines cross it: y = square root of 3 over 2, above the x-axis, and y = negative square root of 3 over 2, below it. Each line crosses the circle at two points, one on each side of the y-axis, for four points in all. The points are marked with dots but not labeled.</w:t>
+        <w:t xml:space="preserve">The unit circle, centered at the origin with radius 1. A dashed horizontal line y = square root of 3 over 2 crosses the circle at two points above the x-axis, one on each side of the y-axis. The points are marked with dots but not labeled.</w:t>
       </w:r>
     </w:p>
     <w:p>
@@ -2957,17 +3017,17 @@
           <w:i/>
           <w:iCs/>
         </w:rPr>
-        <w:t xml:space="preserve">π/3,(2π)/3</w:t>
-      </w:r>
-      <w:r>
-        <w:t xml:space="preserve">, and the minus gives </w:t>
-      </w:r>
-      <w:r>
-        <w:rPr>
-          <w:i/>
-          <w:iCs/>
-        </w:rPr>
-        <w:t xml:space="preserve">(4π)/3,(5π)/3</w:t>
+        <w:t xml:space="preserve">π/3, (2π)/3</w:t>
+      </w:r>
+      <w:r>
+        <w:t xml:space="preserve">, the two points in the picture, and the minus gives </w:t>
+      </w:r>
+      <w:r>
+        <w:rPr>
+          <w:i/>
+          <w:iCs/>
+        </w:rPr>
+        <w:t xml:space="preserve">(4π)/3, (5π)/3</w:t>
       </w:r>
       <w:r>
         <w:t xml:space="preserve">. Keeping only the plus loses half. The list in sixths has cosine </w:t>
@@ -2987,7 +3047,7 @@
           <w:i/>
           <w:iCs/>
         </w:rPr>
-        <w:t xml:space="preserve">π/3,(4π)/3</w:t>
+        <w:t xml:space="preserve">π/3, (4π)/3</w:t>
       </w:r>
       <w:r>
         <w:t xml:space="preserve"> is a tangent pair. </w:t>
@@ -3103,6 +3163,26 @@
           <w:i/>
           <w:iCs/>
         </w:rPr>
+        <w:t xml:space="preserve">(3π)/4</w:t>
+      </w:r>
+      <w:r>
+        <w:t xml:space="preserve">, </w:t>
+      </w:r>
+      <w:r>
+        <w:rPr>
+          <w:i/>
+          <w:iCs/>
+        </w:rPr>
+        <w:t xml:space="preserve">(5π)/4</w:t>
+      </w:r>
+      <w:r>
+        <w:t xml:space="preserve">, </w:t>
+      </w:r>
+      <w:r>
+        <w:rPr>
+          <w:i/>
+          <w:iCs/>
+        </w:rPr>
         <w:t xml:space="preserve">(7π)/4</w:t>
       </w:r>
     </w:p>
@@ -3124,26 +3204,6 @@
           <w:iCs/>
         </w:rPr>
         <w:t xml:space="preserve">π/4</w:t>
-      </w:r>
-      <w:r>
-        <w:t xml:space="preserve">, </w:t>
-      </w:r>
-      <w:r>
-        <w:rPr>
-          <w:i/>
-          <w:iCs/>
-        </w:rPr>
-        <w:t xml:space="preserve">(3π)/4</w:t>
-      </w:r>
-      <w:r>
-        <w:t xml:space="preserve">, </w:t>
-      </w:r>
-      <w:r>
-        <w:rPr>
-          <w:i/>
-          <w:iCs/>
-        </w:rPr>
-        <w:t xml:space="preserve">(5π)/4</w:t>
       </w:r>
       <w:r>
         <w:t xml:space="preserve">, </w:t>
@@ -3298,7 +3358,7 @@
           <w:i/>
           <w:iCs/>
         </w:rPr>
-        <w:t xml:space="preserve">π/4,(7π)/4</w:t>
+        <w:t xml:space="preserve">π/4, (7π)/4</w:t>
       </w:r>
       <w:r>
         <w:t xml:space="preserve"> keeps only the plus. The list in thirds forgets the square root, solving </w:t>
@@ -3314,7 +3374,17 @@
         <w:t xml:space="preserve">θ=±1/2</w:t>
       </w:r>
       <w:r>
-        <w:t xml:space="preserve">. </w:t>
+        <w:t xml:space="preserve">, and </w:t>
+      </w:r>
+      <w:r>
+        <w:rPr>
+          <w:i/>
+          <w:iCs/>
+        </w:rPr>
+        <w:t xml:space="preserve">π/4, (5π)/4</w:t>
+      </w:r>
+      <w:r>
+        <w:t xml:space="preserve"> is a tangent pair. </w:t>
       </w:r>
       <w:r>
         <w:rPr>
@@ -3603,7 +3673,7 @@
           <w:i/>
           <w:iCs/>
         </w:rPr>
-        <w:t xml:space="preserve">π/2,(3π)/2</w:t>
+        <w:t xml:space="preserve">π/2, (3π)/2</w:t>
       </w:r>
       <w:r>
         <w:t xml:space="preserve"> is where cosine is 0. </w:t>
@@ -3924,7 +3994,7 @@
           <w:i/>
           <w:iCs/>
         </w:rPr>
-        <w:t xml:space="preserve">π/6,(5π)/6</w:t>
+        <w:t xml:space="preserve">π/6, (5π)/6</w:t>
       </w:r>
       <w:r>
         <w:t xml:space="preserve"> for the plus and </w:t>
@@ -3934,7 +4004,7 @@
           <w:i/>
           <w:iCs/>
         </w:rPr>
-        <w:t xml:space="preserve">(7π)/6,(11π)/6</w:t>
+        <w:t xml:space="preserve">(7π)/6, (11π)/6</w:t>
       </w:r>
       <w:r>
         <w:t xml:space="preserve"> for the minus. The list in thirds has cosine </w:t>
@@ -4024,7 +4094,7 @@
           <wp:inline distT="0" distB="0" distL="0" distR="0">
             <wp:extent cx="4048125" cy="2476500"/>
             <wp:effectExtent t="0" r="0" b="0" l="0"/>
-            <wp:docPr id="1" name="ma1" descr="One lap for theta and two laps for two theta. Plotted data: Two circles side by side. On the left, an arrow goes once around a circle, labeled theta from 0 to 2 pi, once around. On the right, an arrow spirals twice around a circle, labeled 2 theta from 0 to 4 pi, twice around." title="One lap for theta and two laps for two theta"/>
+            <wp:docPr id="1" name="ma1" descr="One lap for theta and two laps for two theta. Plotted data: Two circles side by side. Each arrow starts on the right side of its circle and turns counterclockwise. On the left, an arrow goes once around a circle, labeled theta from 0 to 2 pi, once around. On the right, an arrow spirals twice around a circle, labeled 2 theta from 0 to 4 pi, twice around." title="One lap for theta and two laps for two theta"/>
             <wp:cNvGraphicFramePr>
               <a:graphicFrameLocks xmlns:a="http://schemas.openxmlformats.org/drawingml/2006/main" noChangeAspect="1"/>
             </wp:cNvGraphicFramePr>
@@ -4078,7 +4148,7 @@
           <w:sz w:val="22"/>
           <w:szCs w:val="22"/>
         </w:rPr>
-        <w:t xml:space="preserve">Two circles side by side. On the left, an arrow goes once around a circle, labeled theta from 0 to 2 pi, once around. On the right, an arrow spirals twice around a circle, labeled 2 theta from 0 to 4 pi, twice around.</w:t>
+        <w:t xml:space="preserve">Two circles side by side. Each arrow starts on the right side of its circle and turns counterclockwise. On the left, an arrow goes once around a circle, labeled theta from 0 to 2 pi, once around. On the right, an arrow spirals twice around a circle, labeled 2 theta from 0 to 4 pi, twice around.</w:t>
       </w:r>
     </w:p>
     <w:p>
@@ -4370,7 +4440,7 @@
           <w:i/>
           <w:iCs/>
         </w:rPr>
-        <w:t xml:space="preserve">π/6,(11π)/6,(13π)/6,(23π)/6</w:t>
+        <w:t xml:space="preserve">π/6, (11π)/6, (13π)/6, (23π)/6</w:t>
       </w:r>
       <w:r>
         <w:t xml:space="preserve">. Then divide each by 2. Stopping after one lap gives only two; not dividing gives </w:t>
@@ -4380,7 +4450,7 @@
           <w:i/>
           <w:iCs/>
         </w:rPr>
-        <w:t xml:space="preserve">π/6,(11π)/6</w:t>
+        <w:t xml:space="preserve">π/6, (11π)/6</w:t>
       </w:r>
       <w:r>
         <w:t xml:space="preserve">; and </w:t>
@@ -4760,7 +4830,7 @@
           <w:i/>
           <w:iCs/>
         </w:rPr>
-        <w:t xml:space="preserve">π/4,(3π)/4</w:t>
+        <w:t xml:space="preserve">π/4, (3π)/4</w:t>
       </w:r>
       <w:r>
         <w:t xml:space="preserve">, then </w:t>
@@ -4770,7 +4840,7 @@
           <w:i/>
           <w:iCs/>
         </w:rPr>
-        <w:t xml:space="preserve">(9π)/4,(11π)/4</w:t>
+        <w:t xml:space="preserve">(9π)/4, (11π)/4</w:t>
       </w:r>
       <w:r>
         <w:t xml:space="preserve">, then </w:t>
@@ -4780,7 +4850,7 @@
           <w:i/>
           <w:iCs/>
         </w:rPr>
-        <w:t xml:space="preserve">(17π)/4,(19π)/4</w:t>
+        <w:t xml:space="preserve">(17π)/4, (19π)/4</w:t>
       </w:r>
       <w:r>
         <w:t xml:space="preserve">. Divide each by 3. Two laps give only four answers, and </w:t>
@@ -4810,7 +4880,7 @@
           <w:i/>
           <w:iCs/>
         </w:rPr>
-        <w:t xml:space="preserve">π/4,(3π)/4</w:t>
+        <w:t xml:space="preserve">π/4, (3π)/4</w:t>
       </w:r>
       <w:r>
         <w:t xml:space="preserve">. </w:t>
@@ -4851,7 +4921,7 @@
           <w:sz w:val="40"/>
           <w:szCs w:val="40"/>
         </w:rPr>
-        <w:t xml:space="preserve">cos</w:t>
+        <w:t xml:space="preserve">sin</w:t>
       </w:r>
       <w:r>
         <w:rPr>
@@ -4860,7 +4930,7 @@
           <w:sz w:val="40"/>
           <w:szCs w:val="40"/>
         </w:rPr>
-        <w:t xml:space="preserve">(4θ)+1=0</w:t>
+        <w:t xml:space="preserve">(2θ)=0</w:t>
       </w:r>
     </w:p>
     <w:p>
@@ -4897,7 +4967,17 @@
           <w:i/>
           <w:iCs/>
         </w:rPr>
-        <w:t xml:space="preserve">π/4</w:t>
+        <w:t xml:space="preserve">0</w:t>
+      </w:r>
+      <w:r>
+        <w:t xml:space="preserve">, </w:t>
+      </w:r>
+      <w:r>
+        <w:rPr>
+          <w:i/>
+          <w:iCs/>
+        </w:rPr>
+        <w:t xml:space="preserve">π/2</w:t>
       </w:r>
     </w:p>
     <w:p>
@@ -4917,37 +4997,27 @@
           <w:i/>
           <w:iCs/>
         </w:rPr>
-        <w:t xml:space="preserve">π/4</w:t>
-      </w:r>
-      <w:r>
-        <w:t xml:space="preserve">, </w:t>
-      </w:r>
-      <w:r>
-        <w:rPr>
-          <w:i/>
-          <w:iCs/>
-        </w:rPr>
-        <w:t xml:space="preserve">(3π)/4</w:t>
-      </w:r>
-      <w:r>
-        <w:t xml:space="preserve">, </w:t>
-      </w:r>
-      <w:r>
-        <w:rPr>
-          <w:i/>
-          <w:iCs/>
-        </w:rPr>
-        <w:t xml:space="preserve">(5π)/4</w:t>
-      </w:r>
-      <w:r>
-        <w:t xml:space="preserve">, </w:t>
-      </w:r>
-      <w:r>
-        <w:rPr>
-          <w:i/>
-          <w:iCs/>
-        </w:rPr>
-        <w:t xml:space="preserve">(7π)/4</w:t>
+        <w:t xml:space="preserve">π/2</w:t>
+      </w:r>
+      <w:r>
+        <w:t xml:space="preserve">, </w:t>
+      </w:r>
+      <w:r>
+        <w:rPr>
+          <w:i/>
+          <w:iCs/>
+        </w:rPr>
+        <w:t xml:space="preserve">π</w:t>
+      </w:r>
+      <w:r>
+        <w:t xml:space="preserve">, </w:t>
+      </w:r>
+      <w:r>
+        <w:rPr>
+          <w:i/>
+          <w:iCs/>
+        </w:rPr>
+        <w:t xml:space="preserve">(3π)/2</w:t>
       </w:r>
     </w:p>
     <w:p>
@@ -4967,47 +5037,37 @@
           <w:i/>
           <w:iCs/>
         </w:rPr>
-        <w:t xml:space="preserve">π/4</w:t>
-      </w:r>
-      <w:r>
-        <w:t xml:space="preserve">, </w:t>
-      </w:r>
-      <w:r>
-        <w:rPr>
-          <w:i/>
-          <w:iCs/>
-        </w:rPr>
-        <w:t xml:space="preserve">(3π)/4</w:t>
-      </w:r>
-      <w:r>
-        <w:t xml:space="preserve">, </w:t>
-      </w:r>
-      <w:r>
-        <w:rPr>
-          <w:i/>
-          <w:iCs/>
-        </w:rPr>
-        <w:t xml:space="preserve">(5π)/4</w:t>
-      </w:r>
-      <w:r>
-        <w:t xml:space="preserve">, </w:t>
-      </w:r>
-      <w:r>
-        <w:rPr>
-          <w:i/>
-          <w:iCs/>
-        </w:rPr>
-        <w:t xml:space="preserve">(7π)/4</w:t>
-      </w:r>
-      <w:r>
-        <w:t xml:space="preserve">, </w:t>
-      </w:r>
-      <w:r>
-        <w:rPr>
-          <w:i/>
-          <w:iCs/>
-        </w:rPr>
-        <w:t xml:space="preserve">(9π)/4</w:t>
+        <w:t xml:space="preserve">0</w:t>
+      </w:r>
+      <w:r>
+        <w:t xml:space="preserve">, </w:t>
+      </w:r>
+      <w:r>
+        <w:rPr>
+          <w:i/>
+          <w:iCs/>
+        </w:rPr>
+        <w:t xml:space="preserve">π/2</w:t>
+      </w:r>
+      <w:r>
+        <w:t xml:space="preserve">, </w:t>
+      </w:r>
+      <w:r>
+        <w:rPr>
+          <w:i/>
+          <w:iCs/>
+        </w:rPr>
+        <w:t xml:space="preserve">π</w:t>
+      </w:r>
+      <w:r>
+        <w:t xml:space="preserve">, </w:t>
+      </w:r>
+      <w:r>
+        <w:rPr>
+          <w:i/>
+          <w:iCs/>
+        </w:rPr>
+        <w:t xml:space="preserve">(3π)/2</w:t>
       </w:r>
     </w:p>
     <w:p>
@@ -5027,17 +5087,47 @@
           <w:i/>
           <w:iCs/>
         </w:rPr>
-        <w:t xml:space="preserve">π/4</w:t>
-      </w:r>
-      <w:r>
-        <w:t xml:space="preserve">, </w:t>
-      </w:r>
-      <w:r>
-        <w:rPr>
-          <w:i/>
-          <w:iCs/>
-        </w:rPr>
-        <w:t xml:space="preserve">(3π)/4</w:t>
+        <w:t xml:space="preserve">0</w:t>
+      </w:r>
+      <w:r>
+        <w:t xml:space="preserve">, </w:t>
+      </w:r>
+      <w:r>
+        <w:rPr>
+          <w:i/>
+          <w:iCs/>
+        </w:rPr>
+        <w:t xml:space="preserve">π/2</w:t>
+      </w:r>
+      <w:r>
+        <w:t xml:space="preserve">, </w:t>
+      </w:r>
+      <w:r>
+        <w:rPr>
+          <w:i/>
+          <w:iCs/>
+        </w:rPr>
+        <w:t xml:space="preserve">π</w:t>
+      </w:r>
+      <w:r>
+        <w:t xml:space="preserve">, </w:t>
+      </w:r>
+      <w:r>
+        <w:rPr>
+          <w:i/>
+          <w:iCs/>
+        </w:rPr>
+        <w:t xml:space="preserve">(3π)/2</w:t>
+      </w:r>
+      <w:r>
+        <w:t xml:space="preserve">, </w:t>
+      </w:r>
+      <w:r>
+        <w:rPr>
+          <w:i/>
+          <w:iCs/>
+        </w:rPr>
+        <w:t xml:space="preserve">2π</w:t>
       </w:r>
     </w:p>
     <w:p>
@@ -5054,37 +5144,57 @@
         <w:spacing w:after="120" w:before="80" w:line="300"/>
       </w:pPr>
       <w:r>
-        <w:t xml:space="preserve">cos</w:t>
-      </w:r>
-      <w:r>
-        <w:rPr>
-          <w:i/>
-          <w:iCs/>
-        </w:rPr>
-        <w:t xml:space="preserve">(4θ)=−1</w:t>
-      </w:r>
-      <w:r>
-        <w:t xml:space="preserve"> only at the leftmost point of the circle, once per lap. With four laps, </w:t>
-      </w:r>
-      <w:r>
-        <w:rPr>
-          <w:i/>
-          <w:iCs/>
-        </w:rPr>
-        <w:t xml:space="preserve">4θ=π, 3π, 5π, 7π</w:t>
-      </w:r>
-      <w:r>
-        <w:t xml:space="preserve">, and dividing by 4 gives four answers. The shorter lists stop early, and </w:t>
-      </w:r>
-      <w:r>
-        <w:rPr>
-          <w:i/>
-          <w:iCs/>
-        </w:rPr>
-        <w:t xml:space="preserve">(9π)/4</w:t>
-      </w:r>
-      <w:r>
-        <w:t xml:space="preserve"> comes from a fifth lap, past </w:t>
+        <w:t xml:space="preserve">Sine is 0 at 0 and </w:t>
+      </w:r>
+      <w:r>
+        <w:rPr>
+          <w:i/>
+          <w:iCs/>
+        </w:rPr>
+        <w:t xml:space="preserve">π</w:t>
+      </w:r>
+      <w:r>
+        <w:t xml:space="preserve">, once per half lap. With two laps, </w:t>
+      </w:r>
+      <w:r>
+        <w:rPr>
+          <w:i/>
+          <w:iCs/>
+        </w:rPr>
+        <w:t xml:space="preserve">2θ=0, π, 2π, 3π</w:t>
+      </w:r>
+      <w:r>
+        <w:t xml:space="preserve">, and dividing by 2 gives </w:t>
+      </w:r>
+      <w:r>
+        <w:rPr>
+          <w:i/>
+          <w:iCs/>
+        </w:rPr>
+        <w:t xml:space="preserve">0, π/2, π, (3π)/2</w:t>
+      </w:r>
+      <w:r>
+        <w:t xml:space="preserve">. Remember that 0 counts: it is in </w:t>
+      </w:r>
+      <w:r>
+        <w:rPr>
+          <w:i/>
+          <w:iCs/>
+        </w:rPr>
+        <w:t xml:space="preserve">[0,2π)</w:t>
+      </w:r>
+      <w:r>
+        <w:t xml:space="preserve">. One lap gives only </w:t>
+      </w:r>
+      <w:r>
+        <w:rPr>
+          <w:i/>
+          <w:iCs/>
+        </w:rPr>
+        <w:t xml:space="preserve">0,π/2</w:t>
+      </w:r>
+      <w:r>
+        <w:t xml:space="preserve">, and </w:t>
       </w:r>
       <w:r>
         <w:rPr>
@@ -5094,16 +5204,16 @@
         <w:t xml:space="preserve">2π</w:t>
       </w:r>
       <w:r>
-        <w:t xml:space="preserve">. </w:t>
-      </w:r>
-      <w:r>
-        <w:rPr>
-          <w:b/>
-          <w:bCs/>
-          <w:i/>
-          <w:iCs/>
-        </w:rPr>
-        <w:t xml:space="preserve">θ=π/4, (3π)/4, (5π)/4, (7π)/4</w:t>
+        <w:t xml:space="preserve"> is not in the interval. </w:t>
+      </w:r>
+      <w:r>
+        <w:rPr>
+          <w:b/>
+          <w:bCs/>
+          <w:i/>
+          <w:iCs/>
+        </w:rPr>
+        <w:t xml:space="preserve">θ=0, π/2, π, (3π)/2</w:t>
       </w:r>
       <w:r>
         <w:rPr>
@@ -5371,7 +5481,7 @@
           <w:i/>
           <w:iCs/>
         </w:rPr>
-        <w:t xml:space="preserve">π/3,(2π)/3,(7π)/3,(8π)/3</w:t>
+        <w:t xml:space="preserve">π/3, (2π)/3, (7π)/3, (8π)/3</w:t>
       </w:r>
       <w:r>
         <w:t xml:space="preserve">. Divide by 2: </w:t>
@@ -5381,7 +5491,7 @@
           <w:i/>
           <w:iCs/>
         </w:rPr>
-        <w:t xml:space="preserve">π/6,π/3,(7π)/6,(4π)/3</w:t>
+        <w:t xml:space="preserve">π/6, π/3, (7π)/6, (4π)/3</w:t>
       </w:r>
       <w:r>
         <w:t xml:space="preserve">. The list </w:t>
@@ -5391,7 +5501,7 @@
           <w:i/>
           <w:iCs/>
         </w:rPr>
-        <w:t xml:space="preserve">π/3,(2π)/3,(7π)/3,(8π)/3</w:t>
+        <w:t xml:space="preserve">π/3, (2π)/3, (7π)/3, (8π)/3</w:t>
       </w:r>
       <w:r>
         <w:t xml:space="preserve"> is the right list for </w:t>
@@ -5404,17 +5514,27 @@
         <w:t xml:space="preserve">2θ</w:t>
       </w:r>
       <w:r>
-        <w:t xml:space="preserve">, before dividing, and two of those are past </w:t>
-      </w:r>
-      <w:r>
-        <w:rPr>
-          <w:i/>
-          <w:iCs/>
-        </w:rPr>
-        <w:t xml:space="preserve">2π</w:t>
-      </w:r>
-      <w:r>
-        <w:t xml:space="preserve">. </w:t>
+        <w:t xml:space="preserve">, before dividing. The pair </w:t>
+      </w:r>
+      <w:r>
+        <w:rPr>
+          <w:i/>
+          <w:iCs/>
+        </w:rPr>
+        <w:t xml:space="preserve">π/6, π/3</w:t>
+      </w:r>
+      <w:r>
+        <w:t xml:space="preserve"> stops after one lap, and </w:t>
+      </w:r>
+      <w:r>
+        <w:rPr>
+          <w:i/>
+          <w:iCs/>
+        </w:rPr>
+        <w:t xml:space="preserve">π/3, (2π)/3</w:t>
+      </w:r>
+      <w:r>
+        <w:t xml:space="preserve"> is one lap without dividing. </w:t>
       </w:r>
       <w:r>
         <w:rPr>
@@ -5525,7 +5645,35 @@
         <w:spacing w:after="120" w:before="80" w:line="300"/>
       </w:pPr>
       <w:r>
-        <w:t xml:space="preserve">A student solved 4cos²θ − 3 = 0 on [0, 2π) with this work. What is the mistake, if any?</w:t>
+        <w:t xml:space="preserve">A student solved </w:t>
+      </w:r>
+      <w:r>
+        <w:rPr>
+          <w:i/>
+          <w:iCs/>
+        </w:rPr>
+        <w:t xml:space="preserve">4 </w:t>
+      </w:r>
+      <w:r>
+        <w:t xml:space="preserve">cos</w:t>
+      </w:r>
+      <w:r>
+        <w:rPr>
+          <w:i/>
+          <w:iCs/>
+          <w:vertAlign w:val="superscript"/>
+        </w:rPr>
+        <w:t xml:space="preserve">2</w:t>
+      </w:r>
+      <w:r>
+        <w:rPr>
+          <w:i/>
+          <w:iCs/>
+        </w:rPr>
+        <w:t xml:space="preserve">θ−3=0</w:t>
+      </w:r>
+      <w:r>
+        <w:t xml:space="preserve"> on [0, 2π) with this work. What is the mistake, if any?</w:t>
       </w:r>
     </w:p>
     <w:p>
@@ -5557,7 +5705,7 @@
         <w:t xml:space="preserve">B.  </w:t>
       </w:r>
       <w:r>
-        <w:t xml:space="preserve">It should be sin θ = √3/2 instead, giving π/3 and 2π/3.</w:t>
+        <w:t xml:space="preserve">It should be sin θ = √3/2 instead, giving π/3 and 2π/3 for θ.</w:t>
       </w:r>
     </w:p>
     <w:p>
@@ -5589,7 +5737,7 @@
         <w:t xml:space="preserve">D.  </w:t>
       </w:r>
       <w:r>
-        <w:t xml:space="preserve">It should be cos θ = 3/4, with no square root taken at all.</w:t>
+        <w:t xml:space="preserve">It should be cos θ = 3/4, with no square root taken at all here.</w:t>
       </w:r>
     </w:p>
     <w:p>
@@ -5718,7 +5866,20 @@
         <w:spacing w:after="120" w:before="80" w:line="300"/>
       </w:pPr>
       <w:r>
-        <w:t xml:space="preserve">A student found all solutions of tan θ − √3 = 0 this way, for all integers k. What is the mistake, if any?</w:t>
+        <w:t xml:space="preserve">A student found all solutions of </w:t>
+      </w:r>
+      <w:r>
+        <w:t xml:space="preserve">tan</w:t>
+      </w:r>
+      <w:r>
+        <w:rPr>
+          <w:i/>
+          <w:iCs/>
+        </w:rPr>
+        <w:t xml:space="preserve">θ−√3=0</w:t>
+      </w:r>
+      <w:r>
+        <w:t xml:space="preserve"> this way, for all integers k. What is the mistake, if any?</w:t>
       </w:r>
     </w:p>
     <w:p>
@@ -5806,7 +5967,7 @@
           <w:i/>
           <w:iCs/>
         </w:rPr>
-        <w:t xml:space="preserve">π/3=(√3/2)/(1/2)=√3</w:t>
+        <w:t xml:space="preserve">(π/3)=(√3/2)/(1/2)=√3</w:t>
       </w:r>
       <w:r>
         <w:t xml:space="preserve">, and tangent repeats every </w:t>
@@ -5944,7 +6105,27 @@
         <w:spacing w:after="120" w:before="80" w:line="300"/>
       </w:pPr>
       <w:r>
-        <w:t xml:space="preserve">A student solved 2sin(2θ) − 1 = 0 on [0, 2π) with this work. What is the mistake, if any?</w:t>
+        <w:t xml:space="preserve">A student solved </w:t>
+      </w:r>
+      <w:r>
+        <w:rPr>
+          <w:i/>
+          <w:iCs/>
+        </w:rPr>
+        <w:t xml:space="preserve">2 </w:t>
+      </w:r>
+      <w:r>
+        <w:t xml:space="preserve">sin</w:t>
+      </w:r>
+      <w:r>
+        <w:rPr>
+          <w:i/>
+          <w:iCs/>
+        </w:rPr>
+        <w:t xml:space="preserve">(2θ)−1=0</w:t>
+      </w:r>
+      <w:r>
+        <w:t xml:space="preserve"> on [0, 2π) with this work. What is the mistake, if any?</w:t>
       </w:r>
     </w:p>
     <w:p>
@@ -6154,7 +6335,27 @@
         <w:spacing w:after="120" w:before="80" w:line="300"/>
       </w:pPr>
       <w:r>
-        <w:t xml:space="preserve">A student solved 2sec θ − 1 = 0 on [0, 2π) with this work. What is the mistake, if any?</w:t>
+        <w:t xml:space="preserve">A student solved </w:t>
+      </w:r>
+      <w:r>
+        <w:rPr>
+          <w:i/>
+          <w:iCs/>
+        </w:rPr>
+        <w:t xml:space="preserve">2 </w:t>
+      </w:r>
+      <w:r>
+        <w:t xml:space="preserve">sec</w:t>
+      </w:r>
+      <w:r>
+        <w:rPr>
+          <w:i/>
+          <w:iCs/>
+        </w:rPr>
+        <w:t xml:space="preserve">θ−1=0</w:t>
+      </w:r>
+      <w:r>
+        <w:t xml:space="preserve"> on [0, 2π) with this work. What is the mistake, if any?</w:t>
       </w:r>
     </w:p>
     <w:p>
@@ -6344,7 +6545,27 @@
         <w:spacing w:after="120" w:before="80" w:line="300"/>
       </w:pPr>
       <w:r>
-        <w:t xml:space="preserve">A student found all solutions of 2cos θ − √3 = 0 this way, for all integers k. What is the mistake, if any?</w:t>
+        <w:t xml:space="preserve">A student found all solutions of </w:t>
+      </w:r>
+      <w:r>
+        <w:rPr>
+          <w:i/>
+          <w:iCs/>
+        </w:rPr>
+        <w:t xml:space="preserve">2 </w:t>
+      </w:r>
+      <w:r>
+        <w:t xml:space="preserve">cos</w:t>
+      </w:r>
+      <w:r>
+        <w:rPr>
+          <w:i/>
+          <w:iCs/>
+        </w:rPr>
+        <w:t xml:space="preserve">θ−√3=0</w:t>
+      </w:r>
+      <w:r>
+        <w:t xml:space="preserve"> this way, for all integers k. What is the mistake, if any?</w:t>
       </w:r>
     </w:p>
     <w:p>

</xml_diff>